<commit_message>
docs & code: sync URD, SRS, API docs with codebase and add ticket void API
</commit_message>
<xml_diff>
--- a/docs/Mau_06_Bien_ban_ban_giao.docx
+++ b/docs/Mau_06_Bien_ban_ban_giao.docx
@@ -763,7 +763,7 @@
           </w:tcPr>
           <w:p>
             <w:r>
-              <w:t>Đầy đủ 38 endpoints (43 operations), request/response mẫu</w:t>
+              <w:t>Đầy đủ 39 endpoints (44 operations), request/response mẫu</w:t>
             </w:r>
           </w:p>
         </w:tc>
@@ -850,7 +850,7 @@
           </w:tcPr>
           <w:p>
             <w:r>
-              <w:t>http://127.0.0.1:8001</w:t>
+              <w:t>Local: http://127.0.0.1:8001 | Cloud: https://itick-platform.onrender.com</w:t>
             </w:r>
           </w:p>
         </w:tc>

</xml_diff>